<commit_message>
Project Documentation File Added
</commit_message>
<xml_diff>
--- a/Zest & Co - Project Submission Documentation.docx
+++ b/Zest & Co - Project Submission Documentation.docx
@@ -24,8 +24,6 @@
         </w:rPr>
         <w:t>ZEST &amp; CO. - PROJECT DOCUMENTATION</w:t>
       </w:r>
-      <w:bookmarkStart w:id="1" w:name="_GoBack"/>
-      <w:bookmarkEnd w:id="1"/>
     </w:p>
     <w:p/>
     <w:p>
@@ -68,15 +66,11 @@
       <w:r>
         <w:t xml:space="preserve"> </w:t>
       </w:r>
-      <w:hyperlink r:id="rId6">
-        <w:r>
-          <w:rPr>
-            <w:color w:val="1155CC"/>
-            <w:u w:val="single"/>
-          </w:rPr>
-          <w:t>https://github.com/mishkatnaveed14/zest-co-Restaurant-Website.git</w:t>
-        </w:r>
-      </w:hyperlink>
+      <w:r>
+        <w:t>https://github.com/mishkatnaveed14/zest-co-Restaurant-Website</w:t>
+      </w:r>
+      <w:bookmarkStart w:id="1" w:name="_GoBack"/>
+      <w:bookmarkEnd w:id="1"/>
     </w:p>
     <w:p>
       <w:pPr>
@@ -156,10 +150,7 @@
         <w:t xml:space="preserve">           </w:t>
       </w:r>
       <w:r>
-        <w:t>Fresh Flavors, Modern Dining, Seamless Experienc</w:t>
-      </w:r>
-      <w:r>
-        <w:t>e</w:t>
+        <w:t>Fresh Flavors, Modern Dining, Seamless Experience</w:t>
       </w:r>
     </w:p>
     <w:p>
@@ -858,15 +849,7 @@
           <w:sz w:val="32"/>
           <w:szCs w:val="32"/>
         </w:rPr>
-        <w:t>S</w:t>
-      </w:r>
-      <w:r>
-        <w:rPr>
-          <w:color w:val="FFC000"/>
-          <w:sz w:val="32"/>
-          <w:szCs w:val="32"/>
-        </w:rPr>
-        <w:t>ECTION 4: CORE PROJECT REQUIREMENTS</w:t>
+        <w:t>SECTION 4: CORE PROJECT REQUIREMENTS</w:t>
       </w:r>
     </w:p>
     <w:p>
@@ -946,10 +929,7 @@
         <w:t xml:space="preserve"> </w:t>
       </w:r>
       <w:r>
-        <w:t xml:space="preserve">Centralized hub for tracking order </w:t>
-      </w:r>
-      <w:r>
-        <w:t>history, viewing active table bookings, and managing saved favorite items.</w:t>
+        <w:t>Centralized hub for tracking order history, viewing active table bookings, and managing saved favorite items.</w:t>
       </w:r>
     </w:p>
     <w:p>
@@ -991,10 +971,7 @@
         <w:t>Search &amp; Filter:</w:t>
       </w:r>
       <w:r>
-        <w:t xml:space="preserve"> Optim</w:t>
-      </w:r>
-      <w:r>
-        <w:t>ized instant menu search bar paired with dynamic category filters for easy navigation.</w:t>
+        <w:t xml:space="preserve"> Optimized instant menu search bar paired with dynamic category filters for easy navigation.</w:t>
       </w:r>
     </w:p>
     <w:p>
@@ -1046,10 +1023,7 @@
         <w:t>Favorites</w:t>
       </w:r>
       <w:r>
-        <w:t>: Integrated add-to-cart workflow and bookmarking fe</w:t>
-      </w:r>
-      <w:r>
-        <w:t>atures for personalized dining planning.</w:t>
+        <w:t>: Integrated add-to-cart workflow and bookmarking features for personalized dining planning.</w:t>
       </w:r>
     </w:p>
     <w:p>
@@ -1143,13 +1117,7 @@
         <w:rPr>
           <w:b/>
         </w:rPr>
-        <w:t>Dynamic Analytics Charts</w:t>
-      </w:r>
-      <w:r>
-        <w:rPr>
-          <w:b/>
-        </w:rPr>
-        <w:t>:</w:t>
+        <w:t>Dynamic Analytics Charts:</w:t>
       </w:r>
       <w:r>
         <w:t xml:space="preserve"> High-level graphical data visualization within the Admin dashboard for monitoring sales and booking trends.</w:t>
@@ -1183,13 +1151,7 @@
         <w:rPr>
           <w:b/>
         </w:rPr>
-        <w:t>Embedded L</w:t>
-      </w:r>
-      <w:r>
-        <w:rPr>
-          <w:b/>
-        </w:rPr>
-        <w:t>ocation Map:</w:t>
+        <w:t>Embedded Location Map:</w:t>
       </w:r>
       <w:r>
         <w:t xml:space="preserve"> Integrated Google Maps section to assist customers with restaurant directions.</w:t>

</xml_diff>